<commit_message>
Conteúdo 3: nova letra g) com DRE por produto e lucro desejado
Nos 3 exercícios de formação de preços (as letras a-f não mudam), a nova
letra g) pede a DRE pelo custeio por absorção, por produto e total, aos
preços de mercado, e compara o lucro operacional de cada produto (% da
receita) com o lucro desejado do markup. O gabarito mostra que os
produtos abaixo da meta são os mesmos em que o mercado paga menos que o
preço sugerido (letra c): iogurte, cadeiras e ração suínos.
Página e .docx; gabaritos cifrados de novo.

Co-Authored-By: Claude Opus 5.5 <noreply@anthropic.com>
Claude-Session: https://claude.ai/code/session_011MUGNEMWRsLJUKMUMKSx3L
</commit_message>
<xml_diff>
--- a/arquivos/Laticinios_Nortao_Formacao_Precos_Enunciado.docx
+++ b/arquivos/Laticinios_Nortao_Formacao_Precos_Enunciado.docx
@@ -737,6 +737,11 @@
         <w:t>f) Para o produto em que o mercado paga menos que o preço sugerido (iogurte), calcule o custo-meta: o custo de produção máximo por unidade que permitiria obter o lucro desejado ao preço de mercado. Quanto o custo precisaria cair? Em que situações a empresa deve formar preço a partir do custo e em quais deve partir do preço de mercado?</w:t>
       </w:r>
     </w:p>
+    <w:p>
+      <w:r>
+        <w:t>g) Monte a DRE pelo custeio por absorção, por produto e total, considerando as vendas do ano aos preços de mercado e o rateio por volume da letra a: receita, custo dos produtos vendidos (CPV), lucro bruto, despesas de venda (comissões e frete), despesas administrativas (4% da receita) e lucro operacional. Calcule o lucro operacional de cada produto em percentual da receita e compare com o lucro desejado de 15% usado no markup. O resultado confirma a análise da letra c?</w:t>
+      </w:r>
+    </w:p>
     <w:sectPr>
       <w:pgSz w:w="12240" w:h="15840"/>
       <w:pgMar w:top="1440" w:right="1800" w:bottom="1440" w:left="1800" w:header="720" w:footer="720" w:gutter="0"/>

</xml_diff>